<commit_message>
Correção de problemas e reestruturação de template
</commit_message>
<xml_diff>
--- a/src/main/resources/templates/Template.docx
+++ b/src/main/resources/templates/Template.docx
@@ -22,110 +22,220 @@
       <w:pPr>
         <w:pStyle w:val="BodyText"/>
         <w:bidi w:val="0"/>
-        <w:spacing w:lineRule="auto" w:line="276" w:before="0" w:after="140"/>
-        <w:jc w:val="start"/>
-        <w:rPr/>
-      </w:pPr>
-      <w:r>
-        <w:rPr/>
-        <w:t xml:space="preserve">Eu, </w:t>
-      </w:r>
-      <w:r>
-        <w:rPr>
-          <w:b/>
-        </w:rPr>
-        <w:t>{{nomeColaborador}}</w:t>
-      </w:r>
-      <w:r>
-        <w:rPr/>
-        <w:t xml:space="preserve">, portador do ID </w:t>
-      </w:r>
-      <w:r>
-        <w:rPr>
-          <w:b/>
-        </w:rPr>
-        <w:t>{{id}}</w:t>
-      </w:r>
-      <w:r>
-        <w:rPr/>
-        <w:t xml:space="preserve">, declaro para os devidos fins que recebi o item/serviço referente a </w:t>
-      </w:r>
-      <w:r>
-        <w:rPr>
-          <w:b/>
-        </w:rPr>
-        <w:t>{{info}}</w:t>
-      </w:r>
-      <w:r>
-        <w:rPr/>
-        <w:t xml:space="preserve"> na data de </w:t>
-      </w:r>
-      <w:r>
-        <w:rPr>
-          <w:b/>
-        </w:rPr>
-        <w:t>{{dataInicio}}</w:t>
-      </w:r>
-      <w:r>
-        <w:rPr/>
-        <w:t>.</w:t>
-      </w:r>
-    </w:p>
-    <w:p>
-      <w:pPr>
-        <w:pStyle w:val="BodyText"/>
-        <w:bidi w:val="0"/>
-        <w:spacing w:lineRule="auto" w:line="276" w:before="0" w:after="140"/>
-        <w:jc w:val="start"/>
-        <w:rPr/>
-      </w:pPr>
-      <w:r>
-        <w:rPr/>
-        <w:t xml:space="preserve">Este documento é do tipo </w:t>
-      </w:r>
-      <w:r>
-        <w:rPr>
-          <w:b/>
-        </w:rPr>
-        <w:t>{{tipo}}</w:t>
-      </w:r>
-      <w:r>
-        <w:rPr/>
-        <w:t xml:space="preserve"> e pertence ao órgão </w:t>
-      </w:r>
-      <w:r>
-        <w:rPr>
-          <w:b/>
-        </w:rPr>
-        <w:t>{{idOrgao}}</w:t>
-      </w:r>
-      <w:r>
-        <w:rPr/>
-        <w:t>.</w:t>
-      </w:r>
-    </w:p>
-    <w:p>
-      <w:pPr>
-        <w:pStyle w:val="BodyText"/>
-        <w:bidi w:val="0"/>
-        <w:spacing w:lineRule="auto" w:line="276" w:before="0" w:after="140"/>
-        <w:jc w:val="start"/>
-        <w:rPr/>
-      </w:pPr>
-      <w:r>
-        <w:rPr/>
+        <w:jc w:val="start"/>
+        <w:rPr>
+          <w:b/>
+        </w:rPr>
+      </w:pPr>
+      <w:r>
+        <w:rPr>
+          <w:b/>
+        </w:rPr>
+      </w:r>
+    </w:p>
+    <w:p>
+      <w:pPr>
+        <w:pStyle w:val="BodyText"/>
+        <w:bidi w:val="0"/>
+        <w:jc w:val="start"/>
+        <w:rPr>
+          <w:b/>
+        </w:rPr>
+      </w:pPr>
+      <w:r>
+        <w:rPr>
+          <w:b/>
+        </w:rPr>
+        <w:t>Eu, {{nomeColaborador}}, portador(a) do ID/Matrícula {{id}}, declaro para os devidos fins que recebi o item/serviço  de patrimônio: {{patrimonio}} e nomeado de {{equipamento}} na data de {{dataInicio}}.</w:t>
+      </w:r>
+    </w:p>
+    <w:p>
+      <w:pPr>
+        <w:pStyle w:val="BodyText"/>
+        <w:bidi w:val="0"/>
+        <w:jc w:val="start"/>
+        <w:rPr>
+          <w:b/>
+        </w:rPr>
+      </w:pPr>
+      <w:r>
+        <w:rPr>
+          <w:b/>
+        </w:rPr>
+        <w:t>Período de Vigência:</w:t>
+      </w:r>
+    </w:p>
+    <w:p>
+      <w:pPr>
+        <w:pStyle w:val="BodyText"/>
+        <w:bidi w:val="0"/>
+        <w:jc w:val="start"/>
+        <w:rPr>
+          <w:b/>
+        </w:rPr>
+      </w:pPr>
+      <w:r>
+        <w:rPr>
+          <w:b/>
+        </w:rPr>
+        <w:t>- Data de Início: {{dataInicio}}</w:t>
+      </w:r>
+    </w:p>
+    <w:p>
+      <w:pPr>
+        <w:pStyle w:val="BodyText"/>
+        <w:bidi w:val="0"/>
+        <w:jc w:val="start"/>
+        <w:rPr>
+          <w:b/>
+        </w:rPr>
+      </w:pPr>
+      <w:r>
+        <w:rPr>
+          <w:b/>
+        </w:rPr>
+        <w:t>- Data de Término: {{dataTermino}}</w:t>
+      </w:r>
+    </w:p>
+    <w:p>
+      <w:pPr>
+        <w:pStyle w:val="BodyText"/>
+        <w:bidi w:val="0"/>
+        <w:jc w:val="start"/>
+        <w:rPr>
+          <w:b/>
+        </w:rPr>
+      </w:pPr>
+      <w:r>
+        <w:rPr>
+          <w:b/>
+        </w:rPr>
+        <w:t>Condições de Uso:</w:t>
+      </w:r>
+    </w:p>
+    <w:p>
+      <w:pPr>
+        <w:pStyle w:val="BodyText"/>
+        <w:bidi w:val="0"/>
+        <w:jc w:val="start"/>
+        <w:rPr>
+          <w:b/>
+        </w:rPr>
+      </w:pPr>
+      <w:r>
+        <w:rPr>
+          <w:b/>
+        </w:rPr>
+        <w:t>O colaborador compromete-se a zelar pela integridade dos ativos recebidos, utilizando-os exclusivamente para as atividades institucionais.</w:t>
+      </w:r>
+    </w:p>
+    <w:p>
+      <w:pPr>
+        <w:pStyle w:val="BodyText"/>
+        <w:bidi w:val="0"/>
+        <w:jc w:val="start"/>
+        <w:rPr>
+          <w:b/>
+        </w:rPr>
+      </w:pPr>
+      <w:r>
+        <w:rPr>
+          <w:b/>
+        </w:rPr>
+      </w:r>
+    </w:p>
+    <w:p>
+      <w:pPr>
+        <w:pStyle w:val="BodyText"/>
+        <w:bidi w:val="0"/>
+        <w:jc w:val="start"/>
+        <w:rPr>
+          <w:b/>
+        </w:rPr>
+      </w:pPr>
+      <w:r>
+        <w:rPr>
+          <w:b/>
+        </w:rPr>
+      </w:r>
+    </w:p>
+    <w:p>
+      <w:pPr>
+        <w:pStyle w:val="BodyText"/>
+        <w:bidi w:val="0"/>
+        <w:jc w:val="start"/>
+        <w:rPr>
+          <w:b/>
+        </w:rPr>
+      </w:pPr>
+      <w:r>
+        <w:rPr>
+          <w:b/>
+        </w:rPr>
+      </w:r>
+    </w:p>
+    <w:p>
+      <w:pPr>
+        <w:pStyle w:val="BodyText"/>
+        <w:bidi w:val="0"/>
+        <w:jc w:val="start"/>
+        <w:rPr>
+          <w:b/>
+        </w:rPr>
+      </w:pPr>
+      <w:r>
+        <w:rPr>
+          <w:b/>
+        </w:rPr>
+        <w:t>Macapá - AP, _____ de ___________________ de 20___.</w:t>
+      </w:r>
+    </w:p>
+    <w:p>
+      <w:pPr>
+        <w:pStyle w:val="BodyText"/>
+        <w:bidi w:val="0"/>
+        <w:jc w:val="start"/>
+        <w:rPr>
+          <w:b/>
+        </w:rPr>
+      </w:pPr>
+      <w:r>
+        <w:rPr>
+          <w:b/>
+        </w:rPr>
+      </w:r>
+    </w:p>
+    <w:p>
+      <w:pPr>
+        <w:pStyle w:val="BodyText"/>
+        <w:bidi w:val="0"/>
+        <w:jc w:val="start"/>
+        <w:rPr>
+          <w:b/>
+        </w:rPr>
+      </w:pPr>
+      <w:r>
+        <w:rPr>
+          <w:b/>
+        </w:rPr>
         <w:t>Assinatura: __________________________________</w:t>
       </w:r>
     </w:p>
     <w:p>
       <w:pPr>
-        <w:pStyle w:val="Normal"/>
-        <w:bidi w:val="0"/>
-        <w:jc w:val="start"/>
-        <w:rPr/>
-      </w:pPr>
-      <w:r>
-        <w:rPr/>
+        <w:pStyle w:val="BodyText"/>
+        <w:bidi w:val="0"/>
+        <w:spacing w:before="0" w:after="140"/>
+        <w:jc w:val="start"/>
+        <w:rPr>
+          <w:b/>
+        </w:rPr>
+      </w:pPr>
+      <w:r>
+        <w:rPr>
+          <w:b/>
+        </w:rPr>
+        <w:t xml:space="preserve">{{nomeColaborador}} </w:t>
       </w:r>
     </w:p>
     <w:sectPr>
@@ -135,6 +245,7 @@
       <w:pgNumType w:fmt="decimal"/>
       <w:formProt w:val="false"/>
       <w:textDirection w:val="lrTb"/>
+      <w:docGrid w:type="default" w:linePitch="100" w:charSpace="0"/>
     </w:sectPr>
   </w:body>
 </w:document>
@@ -154,7 +265,6 @@
     </w:rPrDefault>
     <w:pPrDefault>
       <w:pPr>
-        <w:widowControl/>
         <w:suppressAutoHyphens w:val="true"/>
       </w:pPr>
     </w:pPrDefault>
@@ -164,7 +274,10 @@
     <w:qFormat/>
     <w:pPr>
       <w:widowControl/>
+      <w:suppressAutoHyphens w:val="true"/>
       <w:bidi w:val="0"/>
+      <w:spacing w:before="0" w:after="0"/>
+      <w:jc w:val="start"/>
     </w:pPr>
     <w:rPr>
       <w:rFonts w:ascii="Liberation Serif" w:hAnsi="Liberation Serif" w:eastAsia="DejaVu Sans" w:cs="DejaVu Sans"/>
@@ -221,6 +334,30 @@
   </w:style>
   <w:style w:type="paragraph" w:styleId="ndice">
     <w:name w:val="Índice"/>
+    <w:basedOn w:val="Normal"/>
+    <w:qFormat/>
+    <w:pPr>
+      <w:suppressLineNumbers/>
+    </w:pPr>
+    <w:rPr/>
+  </w:style>
+  <w:style w:type="paragraph" w:styleId="Ttulouser">
+    <w:name w:val="Título (user)"/>
+    <w:basedOn w:val="Normal"/>
+    <w:next w:val="BodyText"/>
+    <w:qFormat/>
+    <w:pPr>
+      <w:keepNext w:val="true"/>
+      <w:spacing w:before="240" w:after="120"/>
+    </w:pPr>
+    <w:rPr>
+      <w:rFonts w:ascii="Liberation Sans" w:hAnsi="Liberation Sans" w:eastAsia="DejaVu Sans" w:cs="DejaVu Sans"/>
+      <w:sz w:val="28"/>
+      <w:szCs w:val="28"/>
+    </w:rPr>
+  </w:style>
+  <w:style w:type="paragraph" w:styleId="ndiceuser">
+    <w:name w:val="Índice (user)"/>
     <w:basedOn w:val="Normal"/>
     <w:qFormat/>
     <w:pPr>

</xml_diff>